<commit_message>
DPS: ronda DPS-01 a DPS-04 (paginación de Planes Anuales y Planes de Clase; «3 HC»)
- DPS-01 Plan Anual 7.º: filas no divisibles, encabezado repetido, unidades seguidas sin saltos
  manuales y tabla PEC entera (14 → 10 págs., sin páginas residuales)
- DPS-02 Planes 8.º: cada plan en hoja propia (26 y 32 ya no quedan partidos); índice recalculado
- DPS-03 Planes Anuales 7.º, 8.º y 9.º: TIEMPO «3 HC» en los 36 encuentros y nota de 120 minutos
- DPS-04 Planes 7.º: índice de los 36 planes
- solo cambian 5 documentos; tomos, solucionarios, imágenes y capacidades sin cambios
- verificar.py: controles de TIEMPO, filas no divisibles e índice de Planes (7.º 271/0, 8.º 362/0, 9.º 351/0)
- INFORME_RONDA_DPS-01_04.md con hashes antes/después

Co-Authored-By: Claude Opus 5.5 <noreply@anthropic.com>
Claude-Session: https://claude.ai/code/session_01LqBrALZn8HbnzzUtvCFRMa
</commit_message>
<xml_diff>
--- a/dps_3er_ciclo/combos_2026/7mo/DPS_7mo_PLAN_ANUAL_PEC_OFICIO_2026.docx
+++ b/dps_3er_ciclo/combos_2026/7mo/DPS_7mo_PLAN_ANUAL_PEC_OFICIO_2026.docx
@@ -108,6 +108,9 @@
         <w:gridCol w:w="7712"/>
       </w:tblGrid>
       <w:tr>
+        <w:trPr>
+          <w:cantSplit/>
+        </w:trPr>
         <w:tc>
           <w:tcPr>
             <w:tcW w:type="dxa" w:w="7712"/>
@@ -165,6 +168,9 @@
         </w:tc>
       </w:tr>
       <w:tr>
+        <w:trPr>
+          <w:cantSplit/>
+        </w:trPr>
         <w:tc>
           <w:tcPr>
             <w:tcW w:type="dxa" w:w="7712"/>
@@ -222,6 +228,9 @@
         </w:tc>
       </w:tr>
       <w:tr>
+        <w:trPr>
+          <w:cantSplit/>
+        </w:trPr>
         <w:tc>
           <w:tcPr>
             <w:tcW w:type="dxa" w:w="7712"/>
@@ -390,13 +399,9 @@
       </w:r>
     </w:p>
     <w:p>
-      <w:r>
-        <w:br w:type="page"/>
-      </w:r>
-    </w:p>
-    <w:p>
       <w:pPr>
-        <w:spacing w:after="60"/>
+        <w:keepNext/>
+        <w:spacing w:after="60" w:before="200"/>
         <w:jc w:val="center"/>
       </w:pPr>
       <w:r>
@@ -410,6 +415,7 @@
     </w:p>
     <w:p>
       <w:pPr>
+        <w:keepNext/>
         <w:spacing w:after="40"/>
       </w:pPr>
       <w:r>
@@ -419,6 +425,21 @@
           <w:sz w:val="16"/>
         </w:rPr>
         <w:t xml:space="preserve">Unidad 1 · febrero–marzo · Capacidades (programa MEC): «Valora la importancia de integrarse y pertenecer a la comunidad educativa.» «Reconoce la organización interna de la institución educativa.»</w:t>
+      </w:r>
+    </w:p>
+    <w:p>
+      <w:pPr>
+        <w:keepNext/>
+        <w:spacing w:after="80"/>
+      </w:pPr>
+      <w:r>
+        <w:rPr>
+          <w:b w:val="0"/>
+          <w:i/>
+          <w:color w:val="555555"/>
+          <w:sz w:val="18"/>
+        </w:rPr>
+        <w:t>En este esquema editorial, cada encuentro dura 3 HC (horas cátedra), que equivalen a 120 minutos; los 36 encuentros suman 108 HC.</w:t>
       </w:r>
     </w:p>
     <w:tbl>
@@ -445,6 +466,10 @@
         <w:gridCol w:w="2203"/>
       </w:tblGrid>
       <w:tr>
+        <w:trPr>
+          <w:cantSplit/>
+          <w:tblHeader/>
+        </w:trPr>
         <w:tc>
           <w:tcPr>
             <w:tcW w:type="dxa" w:w="538"/>
@@ -643,6 +668,9 @@
         </w:tc>
       </w:tr>
       <w:tr>
+        <w:trPr>
+          <w:cantSplit/>
+        </w:trPr>
         <w:tc>
           <w:tcPr>
             <w:tcW w:type="dxa" w:w="538"/>
@@ -746,7 +774,7 @@
                 <w:b w:val="0"/>
                 <w:sz w:val="14"/>
               </w:rPr>
-              <w:t>3 h</w:t>
+              <w:t xml:space="preserve">3 HC</w:t>
             </w:r>
           </w:p>
         </w:tc>
@@ -826,6 +854,9 @@
         </w:tc>
       </w:tr>
       <w:tr>
+        <w:trPr>
+          <w:cantSplit/>
+        </w:trPr>
         <w:tc>
           <w:tcPr>
             <w:tcW w:type="dxa" w:w="538"/>
@@ -929,7 +960,7 @@
                 <w:b w:val="0"/>
                 <w:sz w:val="14"/>
               </w:rPr>
-              <w:t>3 h</w:t>
+              <w:t xml:space="preserve">3 HC</w:t>
             </w:r>
           </w:p>
         </w:tc>
@@ -1009,6 +1040,9 @@
         </w:tc>
       </w:tr>
       <w:tr>
+        <w:trPr>
+          <w:cantSplit/>
+        </w:trPr>
         <w:tc>
           <w:tcPr>
             <w:tcW w:type="dxa" w:w="538"/>
@@ -1112,7 +1146,7 @@
                 <w:b w:val="0"/>
                 <w:sz w:val="14"/>
               </w:rPr>
-              <w:t>3 h</w:t>
+              <w:t xml:space="preserve">3 HC</w:t>
             </w:r>
           </w:p>
         </w:tc>
@@ -1192,6 +1226,9 @@
         </w:tc>
       </w:tr>
       <w:tr>
+        <w:trPr>
+          <w:cantSplit/>
+        </w:trPr>
         <w:tc>
           <w:tcPr>
             <w:tcW w:type="dxa" w:w="538"/>
@@ -1392,6 +1429,9 @@
         </w:tc>
       </w:tr>
       <w:tr>
+        <w:trPr>
+          <w:cantSplit/>
+        </w:trPr>
         <w:tc>
           <w:tcPr>
             <w:tcW w:type="dxa" w:w="538"/>
@@ -1495,7 +1535,7 @@
                 <w:b w:val="0"/>
                 <w:sz w:val="14"/>
               </w:rPr>
-              <w:t>3 h</w:t>
+              <w:t xml:space="preserve">3 HC</w:t>
             </w:r>
           </w:p>
         </w:tc>
@@ -1577,13 +1617,9 @@
       </w:tr>
     </w:tbl>
     <w:p>
-      <w:r>
-        <w:br w:type="page"/>
-      </w:r>
-    </w:p>
-    <w:p>
       <w:pPr>
-        <w:spacing w:after="60"/>
+        <w:keepNext/>
+        <w:spacing w:after="60" w:before="200"/>
         <w:jc w:val="center"/>
       </w:pPr>
       <w:r>
@@ -1597,6 +1633,7 @@
     </w:p>
     <w:p>
       <w:pPr>
+        <w:keepNext/>
         <w:spacing w:after="40"/>
       </w:pPr>
       <w:r>
@@ -1632,6 +1669,10 @@
         <w:gridCol w:w="2203"/>
       </w:tblGrid>
       <w:tr>
+        <w:trPr>
+          <w:cantSplit/>
+          <w:tblHeader/>
+        </w:trPr>
         <w:tc>
           <w:tcPr>
             <w:tcW w:type="dxa" w:w="538"/>
@@ -1830,6 +1871,9 @@
         </w:tc>
       </w:tr>
       <w:tr>
+        <w:trPr>
+          <w:cantSplit/>
+        </w:trPr>
         <w:tc>
           <w:tcPr>
             <w:tcW w:type="dxa" w:w="538"/>
@@ -1933,7 +1977,7 @@
                 <w:b w:val="0"/>
                 <w:sz w:val="14"/>
               </w:rPr>
-              <w:t>3 h</w:t>
+              <w:t xml:space="preserve">3 HC</w:t>
             </w:r>
           </w:p>
         </w:tc>
@@ -2013,6 +2057,9 @@
         </w:tc>
       </w:tr>
       <w:tr>
+        <w:trPr>
+          <w:cantSplit/>
+        </w:trPr>
         <w:tc>
           <w:tcPr>
             <w:tcW w:type="dxa" w:w="538"/>
@@ -2116,7 +2163,7 @@
                 <w:b w:val="0"/>
                 <w:sz w:val="14"/>
               </w:rPr>
-              <w:t>3 h</w:t>
+              <w:t xml:space="preserve">3 HC</w:t>
             </w:r>
           </w:p>
         </w:tc>
@@ -2196,6 +2243,9 @@
         </w:tc>
       </w:tr>
       <w:tr>
+        <w:trPr>
+          <w:cantSplit/>
+        </w:trPr>
         <w:tc>
           <w:tcPr>
             <w:tcW w:type="dxa" w:w="538"/>
@@ -2299,7 +2349,7 @@
                 <w:b w:val="0"/>
                 <w:sz w:val="14"/>
               </w:rPr>
-              <w:t>3 h</w:t>
+              <w:t xml:space="preserve">3 HC</w:t>
             </w:r>
           </w:p>
         </w:tc>
@@ -2379,6 +2429,9 @@
         </w:tc>
       </w:tr>
       <w:tr>
+        <w:trPr>
+          <w:cantSplit/>
+        </w:trPr>
         <w:tc>
           <w:tcPr>
             <w:tcW w:type="dxa" w:w="538"/>
@@ -2482,7 +2535,7 @@
                 <w:b w:val="0"/>
                 <w:sz w:val="14"/>
               </w:rPr>
-              <w:t>3 h</w:t>
+              <w:t xml:space="preserve">3 HC</w:t>
             </w:r>
           </w:p>
         </w:tc>
@@ -2564,13 +2617,9 @@
       </w:tr>
     </w:tbl>
     <w:p>
-      <w:r>
-        <w:br w:type="page"/>
-      </w:r>
-    </w:p>
-    <w:p>
       <w:pPr>
-        <w:spacing w:after="60"/>
+        <w:keepNext/>
+        <w:spacing w:after="60" w:before="200"/>
         <w:jc w:val="center"/>
       </w:pPr>
       <w:r>
@@ -2584,6 +2633,7 @@
     </w:p>
     <w:p>
       <w:pPr>
+        <w:keepNext/>
         <w:spacing w:after="40"/>
       </w:pPr>
       <w:r>
@@ -2619,6 +2669,10 @@
         <w:gridCol w:w="2203"/>
       </w:tblGrid>
       <w:tr>
+        <w:trPr>
+          <w:cantSplit/>
+          <w:tblHeader/>
+        </w:trPr>
         <w:tc>
           <w:tcPr>
             <w:tcW w:type="dxa" w:w="538"/>
@@ -2817,6 +2871,9 @@
         </w:tc>
       </w:tr>
       <w:tr>
+        <w:trPr>
+          <w:cantSplit/>
+        </w:trPr>
         <w:tc>
           <w:tcPr>
             <w:tcW w:type="dxa" w:w="538"/>
@@ -2920,7 +2977,7 @@
                 <w:b w:val="0"/>
                 <w:sz w:val="14"/>
               </w:rPr>
-              <w:t>3 h</w:t>
+              <w:t xml:space="preserve">3 HC</w:t>
             </w:r>
           </w:p>
         </w:tc>
@@ -3000,6 +3057,9 @@
         </w:tc>
       </w:tr>
       <w:tr>
+        <w:trPr>
+          <w:cantSplit/>
+        </w:trPr>
         <w:tc>
           <w:tcPr>
             <w:tcW w:type="dxa" w:w="538"/>
@@ -3103,7 +3163,7 @@
                 <w:b w:val="0"/>
                 <w:sz w:val="14"/>
               </w:rPr>
-              <w:t>3 h</w:t>
+              <w:t xml:space="preserve">3 HC</w:t>
             </w:r>
           </w:p>
         </w:tc>
@@ -3183,6 +3243,9 @@
         </w:tc>
       </w:tr>
       <w:tr>
+        <w:trPr>
+          <w:cantSplit/>
+        </w:trPr>
         <w:tc>
           <w:tcPr>
             <w:tcW w:type="dxa" w:w="538"/>
@@ -3286,7 +3349,7 @@
                 <w:b w:val="0"/>
                 <w:sz w:val="14"/>
               </w:rPr>
-              <w:t>3 h</w:t>
+              <w:t xml:space="preserve">3 HC</w:t>
             </w:r>
           </w:p>
         </w:tc>
@@ -3366,6 +3429,9 @@
         </w:tc>
       </w:tr>
       <w:tr>
+        <w:trPr>
+          <w:cantSplit/>
+        </w:trPr>
         <w:tc>
           <w:tcPr>
             <w:tcW w:type="dxa" w:w="538"/>
@@ -3469,7 +3535,7 @@
                 <w:b w:val="0"/>
                 <w:sz w:val="14"/>
               </w:rPr>
-              <w:t>3 h</w:t>
+              <w:t xml:space="preserve">3 HC</w:t>
             </w:r>
           </w:p>
         </w:tc>
@@ -3551,13 +3617,9 @@
       </w:tr>
     </w:tbl>
     <w:p>
-      <w:r>
-        <w:br w:type="page"/>
-      </w:r>
-    </w:p>
-    <w:p>
       <w:pPr>
-        <w:spacing w:after="60"/>
+        <w:keepNext/>
+        <w:spacing w:after="60" w:before="200"/>
         <w:jc w:val="center"/>
       </w:pPr>
       <w:r>
@@ -3571,6 +3633,7 @@
     </w:p>
     <w:p>
       <w:pPr>
+        <w:keepNext/>
         <w:spacing w:after="40"/>
       </w:pPr>
       <w:r>
@@ -3606,6 +3669,10 @@
         <w:gridCol w:w="2203"/>
       </w:tblGrid>
       <w:tr>
+        <w:trPr>
+          <w:cantSplit/>
+          <w:tblHeader/>
+        </w:trPr>
         <w:tc>
           <w:tcPr>
             <w:tcW w:type="dxa" w:w="538"/>
@@ -3804,6 +3871,9 @@
         </w:tc>
       </w:tr>
       <w:tr>
+        <w:trPr>
+          <w:cantSplit/>
+        </w:trPr>
         <w:tc>
           <w:tcPr>
             <w:tcW w:type="dxa" w:w="538"/>
@@ -3907,7 +3977,7 @@
                 <w:b w:val="0"/>
                 <w:sz w:val="14"/>
               </w:rPr>
-              <w:t>3 h</w:t>
+              <w:t xml:space="preserve">3 HC</w:t>
             </w:r>
           </w:p>
         </w:tc>
@@ -3987,6 +4057,9 @@
         </w:tc>
       </w:tr>
       <w:tr>
+        <w:trPr>
+          <w:cantSplit/>
+        </w:trPr>
         <w:tc>
           <w:tcPr>
             <w:tcW w:type="dxa" w:w="538"/>
@@ -4090,7 +4163,7 @@
                 <w:b w:val="0"/>
                 <w:sz w:val="14"/>
               </w:rPr>
-              <w:t>3 h</w:t>
+              <w:t xml:space="preserve">3 HC</w:t>
             </w:r>
           </w:p>
         </w:tc>
@@ -4170,6 +4243,9 @@
         </w:tc>
       </w:tr>
       <w:tr>
+        <w:trPr>
+          <w:cantSplit/>
+        </w:trPr>
         <w:tc>
           <w:tcPr>
             <w:tcW w:type="dxa" w:w="538"/>
@@ -4273,7 +4349,7 @@
                 <w:b w:val="0"/>
                 <w:sz w:val="14"/>
               </w:rPr>
-              <w:t>3 h</w:t>
+              <w:t xml:space="preserve">3 HC</w:t>
             </w:r>
           </w:p>
         </w:tc>
@@ -4353,6 +4429,9 @@
         </w:tc>
       </w:tr>
       <w:tr>
+        <w:trPr>
+          <w:cantSplit/>
+        </w:trPr>
         <w:tc>
           <w:tcPr>
             <w:tcW w:type="dxa" w:w="538"/>
@@ -4456,7 +4535,7 @@
                 <w:b w:val="0"/>
                 <w:sz w:val="14"/>
               </w:rPr>
-              <w:t>3 h</w:t>
+              <w:t xml:space="preserve">3 HC</w:t>
             </w:r>
           </w:p>
         </w:tc>
@@ -4537,6 +4616,9 @@
         </w:tc>
       </w:tr>
       <w:tr>
+        <w:trPr>
+          <w:cantSplit/>
+        </w:trPr>
         <w:tc>
           <w:tcPr>
             <w:tcW w:type="dxa" w:w="538"/>
@@ -4640,7 +4722,7 @@
                 <w:b w:val="0"/>
                 <w:sz w:val="14"/>
               </w:rPr>
-              <w:t>3 h</w:t>
+              <w:t xml:space="preserve">3 HC</w:t>
             </w:r>
           </w:p>
         </w:tc>
@@ -4722,13 +4804,9 @@
       </w:tr>
     </w:tbl>
     <w:p>
-      <w:r>
-        <w:br w:type="page"/>
-      </w:r>
-    </w:p>
-    <w:p>
       <w:pPr>
-        <w:spacing w:after="60"/>
+        <w:keepNext/>
+        <w:spacing w:after="60" w:before="200"/>
         <w:jc w:val="center"/>
       </w:pPr>
       <w:r>
@@ -4742,6 +4820,7 @@
     </w:p>
     <w:p>
       <w:pPr>
+        <w:keepNext/>
         <w:spacing w:after="40"/>
       </w:pPr>
       <w:r>
@@ -4777,6 +4856,10 @@
         <w:gridCol w:w="2203"/>
       </w:tblGrid>
       <w:tr>
+        <w:trPr>
+          <w:cantSplit/>
+          <w:tblHeader/>
+        </w:trPr>
         <w:tc>
           <w:tcPr>
             <w:tcW w:type="dxa" w:w="538"/>
@@ -4975,6 +5058,9 @@
         </w:tc>
       </w:tr>
       <w:tr>
+        <w:trPr>
+          <w:cantSplit/>
+        </w:trPr>
         <w:tc>
           <w:tcPr>
             <w:tcW w:type="dxa" w:w="538"/>
@@ -5078,7 +5164,7 @@
                 <w:b w:val="0"/>
                 <w:sz w:val="14"/>
               </w:rPr>
-              <w:t>3 h</w:t>
+              <w:t xml:space="preserve">3 HC</w:t>
             </w:r>
           </w:p>
         </w:tc>
@@ -5158,6 +5244,9 @@
         </w:tc>
       </w:tr>
       <w:tr>
+        <w:trPr>
+          <w:cantSplit/>
+        </w:trPr>
         <w:tc>
           <w:tcPr>
             <w:tcW w:type="dxa" w:w="538"/>
@@ -5261,7 +5350,7 @@
                 <w:b w:val="0"/>
                 <w:sz w:val="14"/>
               </w:rPr>
-              <w:t>3 h</w:t>
+              <w:t xml:space="preserve">3 HC</w:t>
             </w:r>
           </w:p>
         </w:tc>
@@ -5341,6 +5430,9 @@
         </w:tc>
       </w:tr>
       <w:tr>
+        <w:trPr>
+          <w:cantSplit/>
+        </w:trPr>
         <w:tc>
           <w:tcPr>
             <w:tcW w:type="dxa" w:w="538"/>
@@ -5542,13 +5634,9 @@
       </w:tr>
     </w:tbl>
     <w:p>
-      <w:r>
-        <w:br w:type="page"/>
-      </w:r>
-    </w:p>
-    <w:p>
       <w:pPr>
-        <w:spacing w:after="60"/>
+        <w:keepNext/>
+        <w:spacing w:after="60" w:before="200"/>
         <w:jc w:val="center"/>
       </w:pPr>
       <w:r>
@@ -5562,6 +5650,7 @@
     </w:p>
     <w:p>
       <w:pPr>
+        <w:keepNext/>
         <w:spacing w:after="40"/>
       </w:pPr>
       <w:r>
@@ -5597,6 +5686,10 @@
         <w:gridCol w:w="2203"/>
       </w:tblGrid>
       <w:tr>
+        <w:trPr>
+          <w:cantSplit/>
+          <w:tblHeader/>
+        </w:trPr>
         <w:tc>
           <w:tcPr>
             <w:tcW w:type="dxa" w:w="538"/>
@@ -5795,6 +5888,9 @@
         </w:tc>
       </w:tr>
       <w:tr>
+        <w:trPr>
+          <w:cantSplit/>
+        </w:trPr>
         <w:tc>
           <w:tcPr>
             <w:tcW w:type="dxa" w:w="538"/>
@@ -5898,7 +5994,7 @@
                 <w:b w:val="0"/>
                 <w:sz w:val="14"/>
               </w:rPr>
-              <w:t>3 h</w:t>
+              <w:t xml:space="preserve">3 HC</w:t>
             </w:r>
           </w:p>
         </w:tc>
@@ -5978,6 +6074,9 @@
         </w:tc>
       </w:tr>
       <w:tr>
+        <w:trPr>
+          <w:cantSplit/>
+        </w:trPr>
         <w:tc>
           <w:tcPr>
             <w:tcW w:type="dxa" w:w="538"/>
@@ -6178,6 +6277,9 @@
         </w:tc>
       </w:tr>
       <w:tr>
+        <w:trPr>
+          <w:cantSplit/>
+        </w:trPr>
         <w:tc>
           <w:tcPr>
             <w:tcW w:type="dxa" w:w="538"/>
@@ -6281,7 +6383,7 @@
                 <w:b w:val="0"/>
                 <w:sz w:val="14"/>
               </w:rPr>
-              <w:t>3 h</w:t>
+              <w:t xml:space="preserve">3 HC</w:t>
             </w:r>
           </w:p>
         </w:tc>
@@ -6363,13 +6465,9 @@
       </w:tr>
     </w:tbl>
     <w:p>
-      <w:r>
-        <w:br w:type="page"/>
-      </w:r>
-    </w:p>
-    <w:p>
       <w:pPr>
-        <w:spacing w:after="60"/>
+        <w:keepNext/>
+        <w:spacing w:after="60" w:before="200"/>
         <w:jc w:val="center"/>
       </w:pPr>
       <w:r>
@@ -6383,6 +6481,7 @@
     </w:p>
     <w:p>
       <w:pPr>
+        <w:keepNext/>
         <w:spacing w:after="40"/>
       </w:pPr>
       <w:r>
@@ -6418,6 +6517,10 @@
         <w:gridCol w:w="2203"/>
       </w:tblGrid>
       <w:tr>
+        <w:trPr>
+          <w:cantSplit/>
+          <w:tblHeader/>
+        </w:trPr>
         <w:tc>
           <w:tcPr>
             <w:tcW w:type="dxa" w:w="538"/>
@@ -6616,6 +6719,9 @@
         </w:tc>
       </w:tr>
       <w:tr>
+        <w:trPr>
+          <w:cantSplit/>
+        </w:trPr>
         <w:tc>
           <w:tcPr>
             <w:tcW w:type="dxa" w:w="538"/>
@@ -6719,7 +6825,7 @@
                 <w:b w:val="0"/>
                 <w:sz w:val="14"/>
               </w:rPr>
-              <w:t>3 h</w:t>
+              <w:t xml:space="preserve">3 HC</w:t>
             </w:r>
           </w:p>
         </w:tc>
@@ -6799,6 +6905,9 @@
         </w:tc>
       </w:tr>
       <w:tr>
+        <w:trPr>
+          <w:cantSplit/>
+        </w:trPr>
         <w:tc>
           <w:tcPr>
             <w:tcW w:type="dxa" w:w="538"/>
@@ -6999,6 +7108,9 @@
         </w:tc>
       </w:tr>
       <w:tr>
+        <w:trPr>
+          <w:cantSplit/>
+        </w:trPr>
         <w:tc>
           <w:tcPr>
             <w:tcW w:type="dxa" w:w="538"/>
@@ -7102,7 +7214,7 @@
                 <w:b w:val="0"/>
                 <w:sz w:val="14"/>
               </w:rPr>
-              <w:t>3 h</w:t>
+              <w:t xml:space="preserve">3 HC</w:t>
             </w:r>
           </w:p>
         </w:tc>
@@ -7182,6 +7294,9 @@
         </w:tc>
       </w:tr>
       <w:tr>
+        <w:trPr>
+          <w:cantSplit/>
+        </w:trPr>
         <w:tc>
           <w:tcPr>
             <w:tcW w:type="dxa" w:w="538"/>
@@ -7285,7 +7400,7 @@
                 <w:b w:val="0"/>
                 <w:sz w:val="14"/>
               </w:rPr>
-              <w:t>3 h</w:t>
+              <w:t xml:space="preserve">3 HC</w:t>
             </w:r>
           </w:p>
         </w:tc>
@@ -7365,6 +7480,9 @@
         </w:tc>
       </w:tr>
       <w:tr>
+        <w:trPr>
+          <w:cantSplit/>
+        </w:trPr>
         <w:tc>
           <w:tcPr>
             <w:tcW w:type="dxa" w:w="538"/>
@@ -7565,6 +7683,9 @@
         </w:tc>
       </w:tr>
       <w:tr>
+        <w:trPr>
+          <w:cantSplit/>
+        </w:trPr>
         <w:tc>
           <w:tcPr>
             <w:tcW w:type="dxa" w:w="538"/>
@@ -7668,7 +7789,7 @@
                 <w:b w:val="0"/>
                 <w:sz w:val="14"/>
               </w:rPr>
-              <w:t>3 h</w:t>
+              <w:t xml:space="preserve">3 HC</w:t>
             </w:r>
           </w:p>
         </w:tc>
@@ -7750,13 +7871,9 @@
       </w:tr>
     </w:tbl>
     <w:p>
-      <w:r>
-        <w:br w:type="page"/>
-      </w:r>
-    </w:p>
-    <w:p>
       <w:pPr>
-        <w:spacing w:after="60"/>
+        <w:keepNext/>
+        <w:spacing w:after="60" w:before="200"/>
         <w:jc w:val="center"/>
       </w:pPr>
       <w:r>
@@ -7770,6 +7887,7 @@
     </w:p>
     <w:p>
       <w:pPr>
+        <w:keepNext/>
         <w:spacing w:after="40"/>
       </w:pPr>
       <w:r>
@@ -7805,6 +7923,10 @@
         <w:gridCol w:w="2203"/>
       </w:tblGrid>
       <w:tr>
+        <w:trPr>
+          <w:cantSplit/>
+          <w:tblHeader/>
+        </w:trPr>
         <w:tc>
           <w:tcPr>
             <w:tcW w:type="dxa" w:w="538"/>
@@ -8003,6 +8125,9 @@
         </w:tc>
       </w:tr>
       <w:tr>
+        <w:trPr>
+          <w:cantSplit/>
+        </w:trPr>
         <w:tc>
           <w:tcPr>
             <w:tcW w:type="dxa" w:w="538"/>
@@ -8106,7 +8231,7 @@
                 <w:b w:val="0"/>
                 <w:sz w:val="14"/>
               </w:rPr>
-              <w:t>3 h</w:t>
+              <w:t xml:space="preserve">3 HC</w:t>
             </w:r>
           </w:p>
         </w:tc>
@@ -8186,6 +8311,9 @@
         </w:tc>
       </w:tr>
       <w:tr>
+        <w:trPr>
+          <w:cantSplit/>
+        </w:trPr>
         <w:tc>
           <w:tcPr>
             <w:tcW w:type="dxa" w:w="538"/>
@@ -8386,6 +8514,9 @@
         </w:tc>
       </w:tr>
       <w:tr>
+        <w:trPr>
+          <w:cantSplit/>
+        </w:trPr>
         <w:tc>
           <w:tcPr>
             <w:tcW w:type="dxa" w:w="538"/>
@@ -8489,7 +8620,7 @@
                 <w:b w:val="0"/>
                 <w:sz w:val="14"/>
               </w:rPr>
-              <w:t>3 h</w:t>
+              <w:t xml:space="preserve">3 HC</w:t>
             </w:r>
           </w:p>
         </w:tc>
@@ -8569,6 +8700,9 @@
         </w:tc>
       </w:tr>
       <w:tr>
+        <w:trPr>
+          <w:cantSplit/>
+        </w:trPr>
         <w:tc>
           <w:tcPr>
             <w:tcW w:type="dxa" w:w="538"/>
@@ -8672,7 +8806,7 @@
                 <w:b w:val="0"/>
                 <w:sz w:val="14"/>
               </w:rPr>
-              <w:t>3 h</w:t>
+              <w:t xml:space="preserve">3 HC</w:t>
             </w:r>
           </w:p>
         </w:tc>
@@ -8752,6 +8886,9 @@
         </w:tc>
       </w:tr>
       <w:tr>
+        <w:trPr>
+          <w:cantSplit/>
+        </w:trPr>
         <w:tc>
           <w:tcPr>
             <w:tcW w:type="dxa" w:w="538"/>
@@ -8855,7 +8992,7 @@
                 <w:b w:val="0"/>
                 <w:sz w:val="14"/>
               </w:rPr>
-              <w:t>3 h</w:t>
+              <w:t xml:space="preserve">3 HC</w:t>
             </w:r>
           </w:p>
         </w:tc>
@@ -8936,6 +9073,9 @@
         </w:tc>
       </w:tr>
       <w:tr>
+        <w:trPr>
+          <w:cantSplit/>
+        </w:trPr>
         <w:tc>
           <w:tcPr>
             <w:tcW w:type="dxa" w:w="538"/>
@@ -9039,7 +9179,7 @@
                 <w:b w:val="0"/>
                 <w:sz w:val="14"/>
               </w:rPr>
-              <w:t>3 h</w:t>
+              <w:t xml:space="preserve">3 HC</w:t>
             </w:r>
           </w:p>
         </w:tc>
@@ -9363,7 +9503,9 @@
       </w:r>
     </w:p>
     <w:p>
-      <w:pPr/>
+      <w:pPr>
+        <w:keepNext/>
+      </w:pPr>
       <w:r>
         <w:rPr>
           <w:sz w:val="19"/>
@@ -9383,6 +9525,9 @@
         <w:gridCol w:w="5141"/>
       </w:tblGrid>
       <w:tr>
+        <w:trPr>
+          <w:cantSplit/>
+        </w:trPr>
         <w:tc>
           <w:tcPr>
             <w:tcW w:type="dxa" w:w="5141"/>
@@ -9390,6 +9535,7 @@
           </w:tcPr>
           <w:p>
             <w:pPr>
+              <w:keepNext/>
               <w:spacing w:after="0" w:before="0"/>
             </w:pPr>
             <w:r>
@@ -9409,6 +9555,7 @@
           </w:tcPr>
           <w:p>
             <w:pPr>
+              <w:keepNext/>
               <w:spacing w:after="0" w:before="0"/>
             </w:pPr>
             <w:r>
@@ -9428,6 +9575,7 @@
           </w:tcPr>
           <w:p>
             <w:pPr>
+              <w:keepNext/>
               <w:spacing w:after="0" w:before="0"/>
             </w:pPr>
             <w:r>
@@ -9442,6 +9590,9 @@
         </w:tc>
       </w:tr>
       <w:tr>
+        <w:trPr>
+          <w:cantSplit/>
+        </w:trPr>
         <w:tc>
           <w:tcPr>
             <w:tcW w:type="dxa" w:w="5141"/>
@@ -9449,6 +9600,7 @@
           </w:tcPr>
           <w:p>
             <w:pPr>
+              <w:keepNext/>
               <w:spacing w:after="0" w:before="0"/>
             </w:pPr>
             <w:r>
@@ -9467,6 +9619,7 @@
           </w:tcPr>
           <w:p>
             <w:pPr>
+              <w:keepNext/>
               <w:spacing w:after="0" w:before="0"/>
             </w:pPr>
             <w:r>
@@ -9485,6 +9638,7 @@
           </w:tcPr>
           <w:p>
             <w:pPr>
+              <w:keepNext/>
               <w:spacing w:after="0" w:before="0"/>
             </w:pPr>
             <w:r>
@@ -9498,6 +9652,9 @@
         </w:tc>
       </w:tr>
       <w:tr>
+        <w:trPr>
+          <w:cantSplit/>
+        </w:trPr>
         <w:tc>
           <w:tcPr>
             <w:tcW w:type="dxa" w:w="5141"/>
@@ -9505,6 +9662,7 @@
           </w:tcPr>
           <w:p>
             <w:pPr>
+              <w:keepNext/>
               <w:spacing w:after="0" w:before="0"/>
             </w:pPr>
             <w:r>
@@ -9523,6 +9681,7 @@
           </w:tcPr>
           <w:p>
             <w:pPr>
+              <w:keepNext/>
               <w:spacing w:after="0" w:before="0"/>
             </w:pPr>
             <w:r>
@@ -9541,6 +9700,7 @@
           </w:tcPr>
           <w:p>
             <w:pPr>
+              <w:keepNext/>
               <w:spacing w:after="0" w:before="0"/>
             </w:pPr>
             <w:r>
@@ -9554,6 +9714,9 @@
         </w:tc>
       </w:tr>
       <w:tr>
+        <w:trPr>
+          <w:cantSplit/>
+        </w:trPr>
         <w:tc>
           <w:tcPr>
             <w:tcW w:type="dxa" w:w="5141"/>
@@ -9561,6 +9724,7 @@
           </w:tcPr>
           <w:p>
             <w:pPr>
+              <w:keepNext/>
               <w:spacing w:after="0" w:before="0"/>
             </w:pPr>
             <w:r>
@@ -9579,6 +9743,7 @@
           </w:tcPr>
           <w:p>
             <w:pPr>
+              <w:keepNext/>
               <w:spacing w:after="0" w:before="0"/>
             </w:pPr>
             <w:r>
@@ -9597,6 +9762,7 @@
           </w:tcPr>
           <w:p>
             <w:pPr>
+              <w:keepNext/>
               <w:spacing w:after="0" w:before="0"/>
             </w:pPr>
             <w:r>
@@ -9610,6 +9776,9 @@
         </w:tc>
       </w:tr>
       <w:tr>
+        <w:trPr>
+          <w:cantSplit/>
+        </w:trPr>
         <w:tc>
           <w:tcPr>
             <w:tcW w:type="dxa" w:w="5141"/>
@@ -9617,6 +9786,7 @@
           </w:tcPr>
           <w:p>
             <w:pPr>
+              <w:keepNext/>
               <w:spacing w:after="0" w:before="0"/>
             </w:pPr>
             <w:r>
@@ -9635,6 +9805,7 @@
           </w:tcPr>
           <w:p>
             <w:pPr>
+              <w:keepNext/>
               <w:spacing w:after="0" w:before="0"/>
             </w:pPr>
             <w:r>
@@ -9653,6 +9824,7 @@
           </w:tcPr>
           <w:p>
             <w:pPr>
+              <w:keepNext/>
               <w:spacing w:after="0" w:before="0"/>
             </w:pPr>
             <w:r>
@@ -9666,6 +9838,9 @@
         </w:tc>
       </w:tr>
       <w:tr>
+        <w:trPr>
+          <w:cantSplit/>
+        </w:trPr>
         <w:tc>
           <w:tcPr>
             <w:tcW w:type="dxa" w:w="5141"/>
@@ -9673,6 +9848,7 @@
           </w:tcPr>
           <w:p>
             <w:pPr>
+              <w:keepNext/>
               <w:spacing w:after="0" w:before="0"/>
             </w:pPr>
             <w:r>
@@ -9691,6 +9867,7 @@
           </w:tcPr>
           <w:p>
             <w:pPr>
+              <w:keepNext/>
               <w:spacing w:after="0" w:before="0"/>
             </w:pPr>
             <w:r>
@@ -9709,6 +9886,7 @@
           </w:tcPr>
           <w:p>
             <w:pPr>
+              <w:keepNext/>
               <w:spacing w:after="0" w:before="0"/>
             </w:pPr>
             <w:r>
@@ -9722,6 +9900,9 @@
         </w:tc>
       </w:tr>
       <w:tr>
+        <w:trPr>
+          <w:cantSplit/>
+        </w:trPr>
         <w:tc>
           <w:tcPr>
             <w:tcW w:type="dxa" w:w="5141"/>

</xml_diff>

<commit_message>
DPS: 2.ª pasada DPS-01/DPS-02 (cierre robusto del Plan Anual 7.º; Plan 1 de 8.º en hoja propia)
- Plan Anual 7.º: sin saltos fijos en el cierre; bloque «Articulación curricular…» + tabla PEC
  siempre unido; probado con cuatro sustituciones de fuente (10–11 págs., sin páginas residuales)
- Planes 8.º: salto antes del Plan 1; índice verificado (36/36)
- evidencia PNG en verificacion/ronda_DPS-01-02_v2/; solo cambian esos dos DOCX

Co-Authored-By: Claude Opus 5.5 <noreply@anthropic.com>
Claude-Session: https://claude.ai/code/session_01LqBrALZn8HbnzzUtvCFRMa
</commit_message>
<xml_diff>
--- a/dps_3er_ciclo/combos_2026/7mo/DPS_7mo_PLAN_ANUAL_PEC_OFICIO_2026.docx
+++ b/dps_3er_ciclo/combos_2026/7mo/DPS_7mo_PLAN_ANUAL_PEC_OFICIO_2026.docx
@@ -9262,8 +9262,9 @@
     </w:tbl>
     <w:p>
       <w:pPr>
-        <w:pageBreakBefore/>
-        <w:spacing w:before="160"/>
+        <w:keepNext/>
+        <w:pageBreakBefore w:val="0"/>
+        <w:spacing w:before="280"/>
         <w:jc w:val="center"/>
       </w:pPr>
       <w:r>
@@ -9277,6 +9278,7 @@
     </w:p>
     <w:p>
       <w:pPr>
+        <w:keepNext/>
         <w:spacing w:before="100" w:after="20"/>
       </w:pPr>
       <w:r>
@@ -9437,6 +9439,7 @@
     </w:p>
     <w:p>
       <w:pPr>
+        <w:keepNext/>
         <w:spacing w:after="20"/>
         <w:ind w:left="173"/>
       </w:pPr>
@@ -9449,6 +9452,7 @@
     </w:p>
     <w:p>
       <w:pPr>
+        <w:keepNext/>
         <w:spacing w:after="20"/>
         <w:ind w:left="173"/>
       </w:pPr>
@@ -9476,6 +9480,9 @@
     <w:p>
       <w:pPr>
         <w:pStyle w:val="Heading1"/>
+        <w:keepNext/>
+        <w:pageBreakBefore w:val="0"/>
+        <w:spacing w:before="280"/>
       </w:pPr>
       <w:r>
         <w:rPr>
@@ -9485,7 +9492,9 @@
       </w:r>
     </w:p>
     <w:p>
-      <w:pPr/>
+      <w:pPr>
+        <w:keepNext/>
+      </w:pPr>
       <w:r>
         <w:rPr>
           <w:sz w:val="19"/>
@@ -9494,7 +9503,9 @@
       </w:r>
     </w:p>
     <w:p>
-      <w:pPr/>
+      <w:pPr>
+        <w:keepNext/>
+      </w:pPr>
       <w:r>
         <w:rPr>
           <w:sz w:val="19"/>
@@ -9910,6 +9921,7 @@
           </w:tcPr>
           <w:p>
             <w:pPr>
+              <w:keepNext/>
               <w:spacing w:after="0" w:before="0"/>
             </w:pPr>
             <w:r>
@@ -9928,6 +9940,7 @@
           </w:tcPr>
           <w:p>
             <w:pPr>
+              <w:keepNext/>
               <w:spacing w:after="0" w:before="0"/>
             </w:pPr>
             <w:r>
@@ -9946,6 +9959,7 @@
           </w:tcPr>
           <w:p>
             <w:pPr>
+              <w:keepNext/>
               <w:spacing w:after="0" w:before="0"/>
             </w:pPr>
             <w:r>
@@ -9960,7 +9974,9 @@
       </w:tr>
     </w:tbl>
     <w:p>
-      <w:pPr/>
+      <w:pPr>
+        <w:keepNext w:val="0"/>
+      </w:pPr>
       <w:r>
         <w:rPr>
           <w:sz w:val="19"/>

</xml_diff>